<commit_message>
Quartz sync: 2024-11-25 10:37:35
</commit_message>
<xml_diff>
--- a/content/Organised/Applications/CVs/Placement CV.docx
+++ b/content/Organised/Applications/CVs/Placement CV.docx
@@ -89,7 +89,7 @@
           <w:b/>
           <w:bCs/>
         </w:rPr>
-        <w:t>Research Team Member, University of Lincoln</w:t>
+        <w:t>Software Developer, Two Can Talk</w:t>
       </w:r>
       <w:r>
         <w:t xml:space="preserve"> (</w:t>
@@ -99,7 +99,7 @@
           <w:i/>
           <w:iCs/>
         </w:rPr>
-        <w:t>Oct 2024 - present</w:t>
+        <w:t>Nov 2024 - present</w:t>
       </w:r>
       <w:r>
         <w:t>)</w:t>
@@ -114,7 +114,7 @@
         </w:numPr>
       </w:pPr>
       <w:r>
-        <w:t>Collaborated with a multidisciplinary team of peers to complete a competitor analysis for Lone Star UK.</w:t>
+        <w:t>Sole developer collaborating directly with company directors to design and implement a bespoke database and web application tailored to manage all aspects of the business operations.</w:t>
       </w:r>
     </w:p>
     <w:p>
@@ -126,7 +126,7 @@
         </w:numPr>
       </w:pPr>
       <w:r>
-        <w:t>Used analytical tools and methodologies to assess key competitors, engaging in regular team meetings to share insights and develop recommendations, enhancing communication and teamwork skills.</w:t>
+        <w:t>Developed a comprehensive appointment management system, enabling efficient scheduling and resource allocation.</w:t>
       </w:r>
     </w:p>
     <w:p>
@@ -138,7 +138,43 @@
         </w:numPr>
       </w:pPr>
       <w:r>
-        <w:t>Presented findings to stakeholders, demonstrating public speaking and presentation abilities while receiving feedback for continuous improvement.</w:t>
+        <w:t>Created a user-friendly frontend interface that facilitates note-taking, employee management, and stock/resource management, enhancing overall operational efficiency.</w:t>
+      </w:r>
+    </w:p>
+    <w:p>
+      <w:pPr>
+        <w:pStyle w:val="Compact"/>
+        <w:numPr>
+          <w:ilvl w:val="0"/>
+          <w:numId w:val="4"/>
+        </w:numPr>
+      </w:pPr>
+      <w:r>
+        <w:t>Integrated analytics tools to provide insights into company data, allowing for informed decision-making and strategic planning.</w:t>
+      </w:r>
+    </w:p>
+    <w:p>
+      <w:pPr>
+        <w:pStyle w:val="Compact"/>
+        <w:numPr>
+          <w:ilvl w:val="0"/>
+          <w:numId w:val="4"/>
+        </w:numPr>
+      </w:pPr>
+      <w:r>
+        <w:t>Utilised modern web technologies and frameworks to ensure a responsive and intuitive user experience, contributing to increased user satisfaction and engagement.</w:t>
+      </w:r>
+    </w:p>
+    <w:p>
+      <w:pPr>
+        <w:pStyle w:val="Compact"/>
+        <w:numPr>
+          <w:ilvl w:val="0"/>
+          <w:numId w:val="4"/>
+        </w:numPr>
+      </w:pPr>
+      <w:r>
+        <w:t>Engaged in regular feedback sessions with stakeholders to refine features and improve functionality, demonstrating strong communication and adaptability skills.</w:t>
       </w:r>
     </w:p>
     <w:p>
@@ -150,7 +186,7 @@
           <w:b/>
           <w:bCs/>
         </w:rPr>
-        <w:t>Research Team Member, British Sugar Biofuel Plant</w:t>
+        <w:t>Research Team Member, University of Lincoln</w:t>
       </w:r>
       <w:r>
         <w:t xml:space="preserve"> (</w:t>
@@ -160,7 +196,7 @@
           <w:i/>
           <w:iCs/>
         </w:rPr>
-        <w:t>Feb 2022 - Dec 2022</w:t>
+        <w:t>Oct 2024 - present</w:t>
       </w:r>
       <w:r>
         <w:t>)</w:t>
@@ -175,7 +211,7 @@
         </w:numPr>
       </w:pPr>
       <w:r>
-        <w:t>Collaborated with students and professionals to identify inefficiencies in biofuel production, developing the ability to work within a team successfully.</w:t>
+        <w:t>Collaborated with a multidisciplinary team of peers to complete a competitor analysis for Lone Star UK.</w:t>
       </w:r>
     </w:p>
     <w:p>
@@ -187,7 +223,19 @@
         </w:numPr>
       </w:pPr>
       <w:r>
-        <w:t>Practised public speaking skills when presenting findings to staff and actively participating in meetings.</w:t>
+        <w:t>Used analytical tools and methodologies to assess key competitors, engaging in regular team meetings to share insights and develop recommendations, enhancing communication and teamwork skills.</w:t>
+      </w:r>
+    </w:p>
+    <w:p>
+      <w:pPr>
+        <w:pStyle w:val="Compact"/>
+        <w:numPr>
+          <w:ilvl w:val="0"/>
+          <w:numId w:val="5"/>
+        </w:numPr>
+      </w:pPr>
+      <w:r>
+        <w:t>Presented findings to stakeholders, demonstrating public speaking and presentation abilities while receiving feedback for continuous improvement.</w:t>
       </w:r>
     </w:p>
     <w:p>
@@ -199,7 +247,7 @@
           <w:b/>
           <w:bCs/>
         </w:rPr>
-        <w:t>Self-Employed Tutor</w:t>
+        <w:t>Research Team Member, British Sugar Biofuel Plant</w:t>
       </w:r>
       <w:r>
         <w:t xml:space="preserve"> (</w:t>
@@ -209,7 +257,7 @@
           <w:i/>
           <w:iCs/>
         </w:rPr>
-        <w:t>Oct 2020 - present</w:t>
+        <w:t>Feb 2022 - Dec 2022</w:t>
       </w:r>
       <w:r>
         <w:t>)</w:t>
@@ -224,7 +272,7 @@
         </w:numPr>
       </w:pPr>
       <w:r>
-        <w:t>Tutored Mathematics, Chemistry, and Physics to GCSE and A-Level students, working to understand their needs to foster a supportive learning environment.</w:t>
+        <w:t>Collaborated with students and professionals to identify inefficiencies in biofuel production, developing the ability to work within a team successfully.</w:t>
       </w:r>
     </w:p>
     <w:p>
@@ -236,31 +284,8 @@
         </w:numPr>
       </w:pPr>
       <w:r>
-        <w:t>Effectively communicated with students and parents to focus on growth areas in the student's education.</w:t>
-      </w:r>
-    </w:p>
-    <w:p>
-      <w:pPr>
-        <w:pStyle w:val="Compact"/>
-        <w:numPr>
-          <w:ilvl w:val="0"/>
-          <w:numId w:val="6"/>
-        </w:numPr>
-      </w:pPr>
-      <w:r>
-        <w:t>Managed all marketing and finances, including invoicing, advertising, and cash handling, in addition to delivery of tuition.</w:t>
-      </w:r>
-    </w:p>
-    <w:p>
-      <w:pPr>
-        <w:pStyle w:val="Compact"/>
-        <w:numPr>
-          <w:ilvl w:val="0"/>
-          <w:numId w:val="6"/>
-        </w:numPr>
-      </w:pPr>
-      <w:r>
-        <w:t>Modelled financial data to calculate suitable pricing that maintains consistent profit despite occasional cancellations, while also mitigating costs for disadvantaged students.</w:t>
+        <w:lastRenderedPageBreak/>
+        <w:t>Practised public speaking skills when presenting findings to staff and actively participating in meetings.</w:t>
       </w:r>
     </w:p>
     <w:p>
@@ -272,7 +297,7 @@
           <w:b/>
           <w:bCs/>
         </w:rPr>
-        <w:t>Volunteer, Air Cadets</w:t>
+        <w:t>Self-Employed Tutor</w:t>
       </w:r>
       <w:r>
         <w:t xml:space="preserve"> (</w:t>
@@ -282,6 +307,79 @@
           <w:i/>
           <w:iCs/>
         </w:rPr>
+        <w:t>Oct 2020 - present</w:t>
+      </w:r>
+      <w:r>
+        <w:t>)</w:t>
+      </w:r>
+    </w:p>
+    <w:p>
+      <w:pPr>
+        <w:pStyle w:val="Compact"/>
+        <w:numPr>
+          <w:ilvl w:val="0"/>
+          <w:numId w:val="7"/>
+        </w:numPr>
+      </w:pPr>
+      <w:r>
+        <w:t>Tutored Mathematics, Chemistry, and Physics to GCSE and A-Level students, working to understand their needs to foster a supportive learning environment.</w:t>
+      </w:r>
+    </w:p>
+    <w:p>
+      <w:pPr>
+        <w:pStyle w:val="Compact"/>
+        <w:numPr>
+          <w:ilvl w:val="0"/>
+          <w:numId w:val="7"/>
+        </w:numPr>
+      </w:pPr>
+      <w:r>
+        <w:t>Effectively communicated with students and parents to focus on growth areas in the student's education.</w:t>
+      </w:r>
+    </w:p>
+    <w:p>
+      <w:pPr>
+        <w:pStyle w:val="Compact"/>
+        <w:numPr>
+          <w:ilvl w:val="0"/>
+          <w:numId w:val="7"/>
+        </w:numPr>
+      </w:pPr>
+      <w:r>
+        <w:t>Managed all marketing and finances, including invoicing, advertising, and cash handling, in addition to delivery of tuition.</w:t>
+      </w:r>
+    </w:p>
+    <w:p>
+      <w:pPr>
+        <w:pStyle w:val="Compact"/>
+        <w:numPr>
+          <w:ilvl w:val="0"/>
+          <w:numId w:val="7"/>
+        </w:numPr>
+      </w:pPr>
+      <w:r>
+        <w:t>Modelled financial data to calculate suitable pricing that maintains consistent profit despite occasional cancellations, while also mitigating costs for disadvantaged students.</w:t>
+      </w:r>
+    </w:p>
+    <w:p>
+      <w:pPr>
+        <w:pStyle w:val="FirstParagraph"/>
+      </w:pPr>
+      <w:r>
+        <w:rPr>
+          <w:b/>
+          <w:bCs/>
+        </w:rPr>
+        <w:t>Volunteer, Air Cadets</w:t>
+      </w:r>
+      <w:r>
+        <w:t xml:space="preserve"> (</w:t>
+      </w:r>
+      <w:r>
+        <w:rPr>
+          <w:i/>
+          <w:iCs/>
+        </w:rPr>
         <w:t>Sept 2017 - Feb 2020</w:t>
       </w:r>
       <w:r>
@@ -293,7 +391,7 @@
         <w:pStyle w:val="Compact"/>
         <w:numPr>
           <w:ilvl w:val="0"/>
-          <w:numId w:val="7"/>
+          <w:numId w:val="8"/>
         </w:numPr>
       </w:pPr>
       <w:r>
@@ -305,11 +403,10 @@
         <w:pStyle w:val="Compact"/>
         <w:numPr>
           <w:ilvl w:val="0"/>
-          <w:numId w:val="7"/>
-        </w:numPr>
-      </w:pPr>
-      <w:r>
-        <w:lastRenderedPageBreak/>
+          <w:numId w:val="8"/>
+        </w:numPr>
+      </w:pPr>
+      <w:r>
         <w:t>Worked within my squadron to deliver on the tasks given, communicating within the team and using initiative to complete essential tasks proactively.</w:t>
       </w:r>
     </w:p>
@@ -366,7 +463,7 @@
         <w:pStyle w:val="Compact"/>
         <w:numPr>
           <w:ilvl w:val="0"/>
-          <w:numId w:val="8"/>
+          <w:numId w:val="9"/>
         </w:numPr>
       </w:pPr>
       <w:r>
@@ -416,7 +513,7 @@
         <w:pStyle w:val="Compact"/>
         <w:numPr>
           <w:ilvl w:val="0"/>
-          <w:numId w:val="9"/>
+          <w:numId w:val="10"/>
         </w:numPr>
       </w:pPr>
       <w:r>
@@ -466,10 +563,11 @@
         <w:pStyle w:val="Compact"/>
         <w:numPr>
           <w:ilvl w:val="0"/>
-          <w:numId w:val="10"/>
-        </w:numPr>
-      </w:pPr>
-      <w:r>
+          <w:numId w:val="11"/>
+        </w:numPr>
+      </w:pPr>
+      <w:r>
+        <w:lastRenderedPageBreak/>
         <w:t>Participated in foreign exchange programs to explore new cultures and practise adapting to new situations.</w:t>
       </w:r>
     </w:p>
@@ -488,7 +586,7 @@
         <w:pStyle w:val="Compact"/>
         <w:numPr>
           <w:ilvl w:val="0"/>
-          <w:numId w:val="11"/>
+          <w:numId w:val="12"/>
         </w:numPr>
       </w:pPr>
       <w:r>
@@ -531,7 +629,7 @@
         <w:pStyle w:val="Compact"/>
         <w:numPr>
           <w:ilvl w:val="0"/>
-          <w:numId w:val="11"/>
+          <w:numId w:val="12"/>
         </w:numPr>
       </w:pPr>
       <w:r>
@@ -557,7 +655,7 @@
         <w:pStyle w:val="Compact"/>
         <w:numPr>
           <w:ilvl w:val="0"/>
-          <w:numId w:val="11"/>
+          <w:numId w:val="12"/>
         </w:numPr>
       </w:pPr>
       <w:r>
@@ -583,7 +681,7 @@
         <w:pStyle w:val="Compact"/>
         <w:numPr>
           <w:ilvl w:val="0"/>
-          <w:numId w:val="11"/>
+          <w:numId w:val="12"/>
         </w:numPr>
       </w:pPr>
       <w:r>
@@ -609,7 +707,7 @@
         <w:pStyle w:val="Compact"/>
         <w:numPr>
           <w:ilvl w:val="0"/>
-          <w:numId w:val="11"/>
+          <w:numId w:val="12"/>
         </w:numPr>
       </w:pPr>
       <w:r>
@@ -669,7 +767,7 @@
         <w:pStyle w:val="Compact"/>
         <w:numPr>
           <w:ilvl w:val="0"/>
-          <w:numId w:val="11"/>
+          <w:numId w:val="12"/>
         </w:numPr>
       </w:pPr>
       <w:r>
@@ -695,7 +793,7 @@
         <w:pStyle w:val="Compact"/>
         <w:numPr>
           <w:ilvl w:val="0"/>
-          <w:numId w:val="11"/>
+          <w:numId w:val="12"/>
         </w:numPr>
       </w:pPr>
       <w:r>
@@ -703,7 +801,6 @@
           <w:b/>
           <w:bCs/>
         </w:rPr>
-        <w:lastRenderedPageBreak/>
         <w:t>Dynamic Logbook</w:t>
       </w:r>
       <w:r>
@@ -732,7 +829,7 @@
         <w:pStyle w:val="Compact"/>
         <w:numPr>
           <w:ilvl w:val="0"/>
-          <w:numId w:val="12"/>
+          <w:numId w:val="13"/>
         </w:numPr>
       </w:pPr>
       <w:r>
@@ -755,7 +852,7 @@
         <w:pStyle w:val="Compact"/>
         <w:numPr>
           <w:ilvl w:val="0"/>
-          <w:numId w:val="12"/>
+          <w:numId w:val="13"/>
         </w:numPr>
       </w:pPr>
       <w:r>
@@ -778,7 +875,7 @@
         <w:pStyle w:val="Compact"/>
         <w:numPr>
           <w:ilvl w:val="0"/>
-          <w:numId w:val="12"/>
+          <w:numId w:val="13"/>
         </w:numPr>
       </w:pPr>
       <w:r>
@@ -811,7 +908,7 @@
         <w:pStyle w:val="Compact"/>
         <w:numPr>
           <w:ilvl w:val="0"/>
-          <w:numId w:val="13"/>
+          <w:numId w:val="14"/>
         </w:numPr>
       </w:pPr>
       <w:r>
@@ -823,19 +920,19 @@
         <w:pStyle w:val="Compact"/>
         <w:numPr>
           <w:ilvl w:val="0"/>
-          <w:numId w:val="13"/>
-        </w:numPr>
-      </w:pPr>
-      <w:r>
-        <w:t>Proficient in Python (and common libraries) with experience in Matlab, Maple, and Typescript, currently learning C++.</w:t>
-      </w:r>
-    </w:p>
-    <w:p>
-      <w:pPr>
-        <w:pStyle w:val="Compact"/>
-        <w:numPr>
-          <w:ilvl w:val="0"/>
-          <w:numId w:val="13"/>
+          <w:numId w:val="14"/>
+        </w:numPr>
+      </w:pPr>
+      <w:r>
+        <w:t>Proficient in Python (and common libraries) and C++, with experience in MATLAB, Maple, Typescript, Lua, and MySQL.</w:t>
+      </w:r>
+    </w:p>
+    <w:p>
+      <w:pPr>
+        <w:pStyle w:val="Compact"/>
+        <w:numPr>
+          <w:ilvl w:val="0"/>
+          <w:numId w:val="14"/>
         </w:numPr>
       </w:pPr>
       <w:r>
@@ -847,7 +944,7 @@
         <w:pStyle w:val="Compact"/>
         <w:numPr>
           <w:ilvl w:val="0"/>
-          <w:numId w:val="13"/>
+          <w:numId w:val="14"/>
         </w:numPr>
       </w:pPr>
       <w:r>
@@ -859,7 +956,7 @@
         <w:pStyle w:val="Compact"/>
         <w:numPr>
           <w:ilvl w:val="0"/>
-          <w:numId w:val="13"/>
+          <w:numId w:val="14"/>
         </w:numPr>
       </w:pPr>
       <w:r>
@@ -871,19 +968,19 @@
         <w:pStyle w:val="Compact"/>
         <w:numPr>
           <w:ilvl w:val="0"/>
-          <w:numId w:val="13"/>
-        </w:numPr>
-      </w:pPr>
-      <w:r>
-        <w:t>Praised in word of mouth referrals for excellent customer service.</w:t>
-      </w:r>
-    </w:p>
-    <w:p>
-      <w:pPr>
-        <w:pStyle w:val="Compact"/>
-        <w:numPr>
-          <w:ilvl w:val="0"/>
-          <w:numId w:val="13"/>
+          <w:numId w:val="14"/>
+        </w:numPr>
+      </w:pPr>
+      <w:r>
+        <w:t>Praised in word-of-mouth referrals for excellent customer service.</w:t>
+      </w:r>
+    </w:p>
+    <w:p>
+      <w:pPr>
+        <w:pStyle w:val="Compact"/>
+        <w:numPr>
+          <w:ilvl w:val="0"/>
+          <w:numId w:val="14"/>
         </w:numPr>
       </w:pPr>
       <w:r>
@@ -897,6 +994,7 @@
       <w:bookmarkStart w:id="7" w:name="interests"/>
       <w:bookmarkEnd w:id="6"/>
       <w:r>
+        <w:lastRenderedPageBreak/>
         <w:t>Interests</w:t>
       </w:r>
     </w:p>
@@ -905,7 +1003,7 @@
         <w:pStyle w:val="Compact"/>
         <w:numPr>
           <w:ilvl w:val="0"/>
-          <w:numId w:val="14"/>
+          <w:numId w:val="15"/>
         </w:numPr>
       </w:pPr>
       <w:r>
@@ -924,7 +1022,7 @@
         <w:pStyle w:val="Compact"/>
         <w:numPr>
           <w:ilvl w:val="0"/>
-          <w:numId w:val="14"/>
+          <w:numId w:val="15"/>
         </w:numPr>
       </w:pPr>
       <w:r>
@@ -943,7 +1041,7 @@
         <w:pStyle w:val="Compact"/>
         <w:numPr>
           <w:ilvl w:val="0"/>
-          <w:numId w:val="14"/>
+          <w:numId w:val="15"/>
         </w:numPr>
       </w:pPr>
       <w:r>
@@ -973,7 +1071,7 @@
   <w:abstractNum w:abstractNumId="0" w15:restartNumberingAfterBreak="0">
     <w:nsid w:val="0000A990"/>
     <w:multiLevelType w:val="multilevel"/>
-    <w:tmpl w:val="E48A3528"/>
+    <w:tmpl w:val="61AC9596"/>
     <w:lvl w:ilvl="0">
       <w:numFmt w:val="bullet"/>
       <w:lvlText w:val=" "/>
@@ -1050,7 +1148,7 @@
   <w:abstractNum w:abstractNumId="1" w15:restartNumberingAfterBreak="0">
     <w:nsid w:val="0000A991"/>
     <w:multiLevelType w:val="multilevel"/>
-    <w:tmpl w:val="93583AB6"/>
+    <w:tmpl w:val="A1B2B95C"/>
     <w:lvl w:ilvl="0">
       <w:numFmt w:val="bullet"/>
       <w:lvlText w:val=""/>
@@ -1258,43 +1356,46 @@
   <w:num w:numId="1" w16cid:durableId="1626231186">
     <w:abstractNumId w:val="2"/>
   </w:num>
-  <w:num w:numId="2" w16cid:durableId="1036739695">
+  <w:num w:numId="2" w16cid:durableId="470900935">
     <w:abstractNumId w:val="0"/>
   </w:num>
-  <w:num w:numId="3" w16cid:durableId="1688560345">
+  <w:num w:numId="3" w16cid:durableId="292178587">
     <w:abstractNumId w:val="1"/>
   </w:num>
-  <w:num w:numId="4" w16cid:durableId="1894657558">
+  <w:num w:numId="4" w16cid:durableId="421537379">
     <w:abstractNumId w:val="1"/>
   </w:num>
-  <w:num w:numId="5" w16cid:durableId="10424891">
+  <w:num w:numId="5" w16cid:durableId="469369085">
     <w:abstractNumId w:val="1"/>
   </w:num>
-  <w:num w:numId="6" w16cid:durableId="1390155818">
+  <w:num w:numId="6" w16cid:durableId="859203139">
     <w:abstractNumId w:val="1"/>
   </w:num>
-  <w:num w:numId="7" w16cid:durableId="1879858220">
+  <w:num w:numId="7" w16cid:durableId="673410583">
     <w:abstractNumId w:val="1"/>
   </w:num>
-  <w:num w:numId="8" w16cid:durableId="650526812">
+  <w:num w:numId="8" w16cid:durableId="1950312711">
     <w:abstractNumId w:val="1"/>
   </w:num>
-  <w:num w:numId="9" w16cid:durableId="1056779253">
+  <w:num w:numId="9" w16cid:durableId="1547378737">
     <w:abstractNumId w:val="1"/>
   </w:num>
-  <w:num w:numId="10" w16cid:durableId="96297636">
+  <w:num w:numId="10" w16cid:durableId="1656371623">
     <w:abstractNumId w:val="1"/>
   </w:num>
-  <w:num w:numId="11" w16cid:durableId="167015807">
+  <w:num w:numId="11" w16cid:durableId="593825559">
     <w:abstractNumId w:val="1"/>
   </w:num>
-  <w:num w:numId="12" w16cid:durableId="1071267817">
+  <w:num w:numId="12" w16cid:durableId="349988975">
     <w:abstractNumId w:val="1"/>
   </w:num>
-  <w:num w:numId="13" w16cid:durableId="943415321">
+  <w:num w:numId="13" w16cid:durableId="976646387">
     <w:abstractNumId w:val="1"/>
   </w:num>
-  <w:num w:numId="14" w16cid:durableId="1231430385">
+  <w:num w:numId="14" w16cid:durableId="3629222">
+    <w:abstractNumId w:val="1"/>
+  </w:num>
+  <w:num w:numId="15" w16cid:durableId="13926106">
     <w:abstractNumId w:val="1"/>
   </w:num>
 </w:numbering>

</xml_diff>